<commit_message>
update revised SRS document and PDF
</commit_message>
<xml_diff>
--- a/documents/requirements/Nexora-SRS.docx
+++ b/documents/requirements/Nexora-SRS.docx
@@ -858,7 +858,17 @@
                                       <w:rtl/>
                                       <w:lang w:bidi="fa-IR"/>
                                     </w:rPr>
-                                    <w:t>شماره دانشجویی</w:t>
+                                    <w:t xml:space="preserve">شماره </w:t>
+                                  </w:r>
+                                  <w:r>
+                                    <w:rPr>
+                                      <w:rFonts w:hint="cs"/>
+                                      <w:sz w:val="28"/>
+                                      <w:szCs w:val="28"/>
+                                      <w:rtl/>
+                                      <w:lang w:bidi="fa-IR"/>
+                                    </w:rPr>
+                                    <w:t>دانشجویی</w:t>
                                   </w:r>
                                 </w:p>
                               </w:txbxContent>
@@ -1285,7 +1295,7 @@
               </mc:Choice>
               <mc:Fallback>
                 <w:pict>
-                  <v:line w14:anchorId="02204AEC" id="Straight Connector 4" o:spid="_x0000_s1026" style="position:absolute;flip:x;z-index:251660800;visibility:visible;mso-wrap-style:square;mso-width-percent:0;mso-height-percent:0;mso-wrap-distance-left:9pt;mso-wrap-distance-top:0;mso-wrap-distance-right:9pt;mso-wrap-distance-bottom:0;mso-position-horizontal:absolute;mso-position-horizontal-relative:text;mso-position-vertical:absolute;mso-position-vertical-relative:text;mso-width-percent:0;mso-height-percent:0;mso-width-relative:margin;mso-height-relative:margin" from=".6pt,142.8pt" to="481.3pt,142.8pt" o:gfxdata="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" strokecolor="#4579b8 [3044]"/>
+                  <v:line w14:anchorId="27959035" id="Straight Connector 4" o:spid="_x0000_s1026" style="position:absolute;flip:x;z-index:251660800;visibility:visible;mso-wrap-style:square;mso-width-percent:0;mso-height-percent:0;mso-wrap-distance-left:9pt;mso-wrap-distance-top:0;mso-wrap-distance-right:9pt;mso-wrap-distance-bottom:0;mso-position-horizontal:absolute;mso-position-horizontal-relative:text;mso-position-vertical:absolute;mso-position-vertical-relative:text;mso-width-percent:0;mso-height-percent:0;mso-width-relative:margin;mso-height-relative:margin" from=".6pt,142.8pt" to="481.3pt,142.8pt" o:gfxdata="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" strokecolor="#4579b8 [3044]"/>
                 </w:pict>
               </mc:Fallback>
             </mc:AlternateContent>
@@ -1355,7 +1365,7 @@
               </mc:Choice>
               <mc:Fallback>
                 <w:pict>
-                  <v:line w14:anchorId="02F53A50" id="Straight Connector 3" o:spid="_x0000_s1026" style="position:absolute;flip:x;z-index:251653632;visibility:visible;mso-wrap-style:square;mso-width-percent:0;mso-height-percent:0;mso-wrap-distance-left:9pt;mso-wrap-distance-top:0;mso-wrap-distance-right:9pt;mso-wrap-distance-bottom:0;mso-position-horizontal:absolute;mso-position-horizontal-relative:text;mso-position-vertical:absolute;mso-position-vertical-relative:text;mso-width-percent:0;mso-height-percent:0;mso-width-relative:margin;mso-height-relative:margin" from=".6pt,43.8pt" to="481.3pt,43.8pt" o:gfxdata="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" strokecolor="#4579b8 [3044]" strokeweight="6pt"/>
+                  <v:line w14:anchorId="758D07E9" id="Straight Connector 3" o:spid="_x0000_s1026" style="position:absolute;flip:x;z-index:251653632;visibility:visible;mso-wrap-style:square;mso-width-percent:0;mso-height-percent:0;mso-wrap-distance-left:9pt;mso-wrap-distance-top:0;mso-wrap-distance-right:9pt;mso-wrap-distance-bottom:0;mso-position-horizontal:absolute;mso-position-horizontal-relative:text;mso-position-vertical:absolute;mso-position-vertical-relative:text;mso-width-percent:0;mso-height-percent:0;mso-width-relative:margin;mso-height-relative:margin" from=".6pt,43.8pt" to="481.3pt,43.8pt" o:gfxdata="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" strokecolor="#4579b8 [3044]" strokeweight="6pt"/>
                 </w:pict>
               </mc:Fallback>
             </mc:AlternateContent>
@@ -1424,7 +1434,7 @@
               </mc:Choice>
               <mc:Fallback>
                 <w:pict>
-                  <v:line w14:anchorId="04DD1675" id="Straight Connector 2" o:spid="_x0000_s1026" style="position:absolute;flip:x;z-index:251644416;visibility:visible;mso-wrap-style:square;mso-width-percent:0;mso-height-percent:0;mso-wrap-distance-left:9pt;mso-wrap-distance-top:0;mso-wrap-distance-right:9pt;mso-wrap-distance-bottom:0;mso-position-horizontal:absolute;mso-position-horizontal-relative:text;mso-position-vertical:absolute;mso-position-vertical-relative:text;mso-width-percent:0;mso-height-percent:0;mso-width-relative:margin;mso-height-relative:margin" from=".9pt,37.2pt" to="481.6pt,37.2pt" o:gfxdata="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" strokecolor="#4579b8 [3044]"/>
+                  <v:line w14:anchorId="19704A6E" id="Straight Connector 2" o:spid="_x0000_s1026" style="position:absolute;flip:x;z-index:251644416;visibility:visible;mso-wrap-style:square;mso-width-percent:0;mso-height-percent:0;mso-wrap-distance-left:9pt;mso-wrap-distance-top:0;mso-wrap-distance-right:9pt;mso-wrap-distance-bottom:0;mso-position-horizontal:absolute;mso-position-horizontal-relative:text;mso-position-vertical:absolute;mso-position-vertical-relative:text;mso-width-percent:0;mso-height-percent:0;mso-width-relative:margin;mso-height-relative:margin" from=".9pt,37.2pt" to="481.6pt,37.2pt" o:gfxdata="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" strokecolor="#4579b8 [3044]"/>
                 </w:pict>
               </mc:Fallback>
             </mc:AlternateContent>
@@ -1505,6 +1515,7 @@
         <w:bidi/>
         <w:spacing w:after="60"/>
         <w:ind w:right="-82"/>
+        <w:jc w:val="center"/>
       </w:pPr>
       <w:r>
         <w:rPr>
@@ -1579,7 +1590,28 @@
           <w:szCs w:val="24"/>
           <w:rtl/>
         </w:rPr>
-        <w:t xml:space="preserve"> استفاده از سند  ............................................................  </w:t>
+        <w:t xml:space="preserve"> استفاده از سند  ..........</w:t>
+      </w:r>
+      <w:r>
+        <w:rPr>
+          <w:rFonts w:hint="cs"/>
+          <w:b/>
+          <w:color w:val="1A1A1A"/>
+          <w:sz w:val="24"/>
+          <w:szCs w:val="24"/>
+          <w:rtl/>
+        </w:rPr>
+        <w:t>..................................................................</w:t>
+      </w:r>
+      <w:r>
+        <w:rPr>
+          <w:b/>
+          <w:color w:val="1A1A1A"/>
+          <w:sz w:val="24"/>
+          <w:szCs w:val="24"/>
+          <w:rtl/>
+        </w:rPr>
+        <w:t xml:space="preserve">..................................................  </w:t>
       </w:r>
       <w:r>
         <w:rPr>
@@ -1597,6 +1629,7 @@
       <w:pPr>
         <w:bidi/>
         <w:spacing w:after="60"/>
+        <w:jc w:val="center"/>
       </w:pPr>
       <w:r>
         <w:rPr>
@@ -1682,7 +1715,28 @@
           <w:szCs w:val="24"/>
           <w:rtl/>
         </w:rPr>
-        <w:t xml:space="preserve">  ............................................................  </w:t>
+        <w:t xml:space="preserve">  ....................</w:t>
+      </w:r>
+      <w:r>
+        <w:rPr>
+          <w:rFonts w:hint="cs"/>
+          <w:b/>
+          <w:color w:val="1A1A1A"/>
+          <w:sz w:val="24"/>
+          <w:szCs w:val="24"/>
+          <w:rtl/>
+        </w:rPr>
+        <w:t>................................................................................</w:t>
+      </w:r>
+      <w:r>
+        <w:rPr>
+          <w:b/>
+          <w:color w:val="1A1A1A"/>
+          <w:sz w:val="24"/>
+          <w:szCs w:val="24"/>
+          <w:rtl/>
+        </w:rPr>
+        <w:t xml:space="preserve">.................................  </w:t>
       </w:r>
       <w:r>
         <w:rPr>
@@ -1700,6 +1754,7 @@
       <w:pPr>
         <w:bidi/>
         <w:spacing w:after="60"/>
+        <w:jc w:val="center"/>
       </w:pPr>
       <w:r>
         <w:rPr>
@@ -1860,7 +1915,49 @@
           <w:szCs w:val="24"/>
           <w:rtl/>
         </w:rPr>
-        <w:t xml:space="preserve">  ............................................................  </w:t>
+        <w:t xml:space="preserve">  ...............</w:t>
+      </w:r>
+      <w:r>
+        <w:rPr>
+          <w:rFonts w:hint="cs"/>
+          <w:b/>
+          <w:color w:val="1A1A1A"/>
+          <w:sz w:val="24"/>
+          <w:szCs w:val="24"/>
+          <w:rtl/>
+        </w:rPr>
+        <w:t>...</w:t>
+      </w:r>
+      <w:r>
+        <w:rPr>
+          <w:b/>
+          <w:color w:val="1A1A1A"/>
+          <w:sz w:val="24"/>
+          <w:szCs w:val="24"/>
+          <w:rtl/>
+        </w:rPr>
+        <w:t>...............</w:t>
+      </w:r>
+      <w:r>
+        <w:rPr>
+          <w:rFonts w:hint="cs"/>
+          <w:b/>
+          <w:color w:val="1A1A1A"/>
+          <w:sz w:val="24"/>
+          <w:szCs w:val="24"/>
+          <w:rtl/>
+        </w:rPr>
+        <w:t>..................................................................</w:t>
+      </w:r>
+      <w:r>
+        <w:rPr>
+          <w:b/>
+          <w:color w:val="1A1A1A"/>
+          <w:sz w:val="24"/>
+          <w:szCs w:val="24"/>
+          <w:rtl/>
+        </w:rPr>
+        <w:t xml:space="preserve">..............................  </w:t>
       </w:r>
       <w:r>
         <w:rPr>
@@ -1878,6 +1975,7 @@
       <w:pPr>
         <w:bidi/>
         <w:spacing w:after="60"/>
+        <w:jc w:val="center"/>
       </w:pPr>
       <w:r>
         <w:rPr>
@@ -1931,7 +2029,49 @@
           <w:szCs w:val="24"/>
           <w:rtl/>
         </w:rPr>
-        <w:t xml:space="preserve">نقش‌ها و قواعد کسب‌وکار  ............................................................  </w:t>
+        <w:t>نقش‌ها و قواعد کسب‌وکار  ......................</w:t>
+      </w:r>
+      <w:r>
+        <w:rPr>
+          <w:rFonts w:hint="cs"/>
+          <w:b/>
+          <w:color w:val="1A1A1A"/>
+          <w:sz w:val="24"/>
+          <w:szCs w:val="24"/>
+          <w:rtl/>
+        </w:rPr>
+        <w:t>.....</w:t>
+      </w:r>
+      <w:r>
+        <w:rPr>
+          <w:b/>
+          <w:color w:val="1A1A1A"/>
+          <w:sz w:val="24"/>
+          <w:szCs w:val="24"/>
+          <w:rtl/>
+        </w:rPr>
+        <w:t>.......</w:t>
+      </w:r>
+      <w:r>
+        <w:rPr>
+          <w:rFonts w:hint="cs"/>
+          <w:b/>
+          <w:color w:val="1A1A1A"/>
+          <w:sz w:val="24"/>
+          <w:szCs w:val="24"/>
+          <w:rtl/>
+        </w:rPr>
+        <w:t>.....................................................................</w:t>
+      </w:r>
+      <w:r>
+        <w:rPr>
+          <w:b/>
+          <w:color w:val="1A1A1A"/>
+          <w:sz w:val="24"/>
+          <w:szCs w:val="24"/>
+          <w:rtl/>
+        </w:rPr>
+        <w:t xml:space="preserve">...............................  </w:t>
       </w:r>
       <w:r>
         <w:rPr>
@@ -1949,6 +2089,7 @@
       <w:pPr>
         <w:bidi/>
         <w:spacing w:after="60"/>
+        <w:jc w:val="center"/>
       </w:pPr>
       <w:r>
         <w:rPr>
@@ -2034,7 +2175,28 @@
           <w:szCs w:val="24"/>
           <w:rtl/>
         </w:rPr>
-        <w:t xml:space="preserve"> و نشست  ............................................................  </w:t>
+        <w:t xml:space="preserve"> و نشست  .......................................</w:t>
+      </w:r>
+      <w:r>
+        <w:rPr>
+          <w:rFonts w:hint="cs"/>
+          <w:b/>
+          <w:color w:val="1A1A1A"/>
+          <w:sz w:val="24"/>
+          <w:szCs w:val="24"/>
+          <w:rtl/>
+        </w:rPr>
+        <w:t>..................................................................................</w:t>
+      </w:r>
+      <w:r>
+        <w:rPr>
+          <w:b/>
+          <w:color w:val="1A1A1A"/>
+          <w:sz w:val="24"/>
+          <w:szCs w:val="24"/>
+          <w:rtl/>
+        </w:rPr>
+        <w:t xml:space="preserve">.....................  </w:t>
       </w:r>
       <w:r>
         <w:rPr>
@@ -2052,6 +2214,7 @@
       <w:pPr>
         <w:bidi/>
         <w:spacing w:after="60"/>
+        <w:jc w:val="center"/>
       </w:pPr>
       <w:r>
         <w:rPr>
@@ -2180,7 +2343,28 @@
           <w:szCs w:val="24"/>
           <w:rtl/>
         </w:rPr>
-        <w:t xml:space="preserve"> سازمان  ............................................................  </w:t>
+        <w:t xml:space="preserve"> سازمان  .............................</w:t>
+      </w:r>
+      <w:r>
+        <w:rPr>
+          <w:rFonts w:hint="cs"/>
+          <w:b/>
+          <w:color w:val="1A1A1A"/>
+          <w:sz w:val="24"/>
+          <w:szCs w:val="24"/>
+          <w:rtl/>
+        </w:rPr>
+        <w:t>...........................................................................</w:t>
+      </w:r>
+      <w:r>
+        <w:rPr>
+          <w:b/>
+          <w:color w:val="1A1A1A"/>
+          <w:sz w:val="24"/>
+          <w:szCs w:val="24"/>
+          <w:rtl/>
+        </w:rPr>
+        <w:t xml:space="preserve">...............................  </w:t>
       </w:r>
       <w:r>
         <w:rPr>
@@ -2198,6 +2382,7 @@
       <w:pPr>
         <w:bidi/>
         <w:spacing w:after="60"/>
+        <w:jc w:val="center"/>
       </w:pPr>
       <w:r>
         <w:rPr>
@@ -2272,7 +2457,49 @@
           <w:szCs w:val="24"/>
           <w:rtl/>
         </w:rPr>
-        <w:t xml:space="preserve"> دانش و مجوز منابع  ............................................................  </w:t>
+        <w:t xml:space="preserve"> دانش و مجوز منابع  ...............</w:t>
+      </w:r>
+      <w:r>
+        <w:rPr>
+          <w:rFonts w:hint="cs"/>
+          <w:b/>
+          <w:color w:val="1A1A1A"/>
+          <w:sz w:val="24"/>
+          <w:szCs w:val="24"/>
+          <w:rtl/>
+        </w:rPr>
+        <w:t>...........</w:t>
+      </w:r>
+      <w:r>
+        <w:rPr>
+          <w:b/>
+          <w:color w:val="1A1A1A"/>
+          <w:sz w:val="24"/>
+          <w:szCs w:val="24"/>
+          <w:rtl/>
+        </w:rPr>
+        <w:t>..................</w:t>
+      </w:r>
+      <w:r>
+        <w:rPr>
+          <w:rFonts w:hint="cs"/>
+          <w:b/>
+          <w:color w:val="1A1A1A"/>
+          <w:sz w:val="24"/>
+          <w:szCs w:val="24"/>
+          <w:rtl/>
+        </w:rPr>
+        <w:t>..............................................</w:t>
+      </w:r>
+      <w:r>
+        <w:rPr>
+          <w:b/>
+          <w:color w:val="1A1A1A"/>
+          <w:sz w:val="24"/>
+          <w:szCs w:val="24"/>
+          <w:rtl/>
+        </w:rPr>
+        <w:t xml:space="preserve">...........................  </w:t>
       </w:r>
       <w:r>
         <w:rPr>
@@ -2290,6 +2517,7 @@
       <w:pPr>
         <w:bidi/>
         <w:spacing w:after="60"/>
+        <w:jc w:val="center"/>
       </w:pPr>
       <w:r>
         <w:rPr>
@@ -2428,7 +2656,49 @@
           <w:szCs w:val="24"/>
           <w:rtl/>
         </w:rPr>
-        <w:t xml:space="preserve">  ............................................................  </w:t>
+        <w:t xml:space="preserve">  .....................</w:t>
+      </w:r>
+      <w:r>
+        <w:rPr>
+          <w:rFonts w:hint="cs"/>
+          <w:b/>
+          <w:color w:val="1A1A1A"/>
+          <w:sz w:val="24"/>
+          <w:szCs w:val="24"/>
+          <w:rtl/>
+        </w:rPr>
+        <w:t>..........</w:t>
+      </w:r>
+      <w:r>
+        <w:rPr>
+          <w:b/>
+          <w:color w:val="1A1A1A"/>
+          <w:sz w:val="24"/>
+          <w:szCs w:val="24"/>
+          <w:rtl/>
+        </w:rPr>
+        <w:t>........</w:t>
+      </w:r>
+      <w:r>
+        <w:rPr>
+          <w:rFonts w:hint="cs"/>
+          <w:b/>
+          <w:color w:val="1A1A1A"/>
+          <w:sz w:val="24"/>
+          <w:szCs w:val="24"/>
+          <w:rtl/>
+        </w:rPr>
+        <w:t>.....................................................</w:t>
+      </w:r>
+      <w:r>
+        <w:rPr>
+          <w:b/>
+          <w:color w:val="1A1A1A"/>
+          <w:sz w:val="24"/>
+          <w:szCs w:val="24"/>
+          <w:rtl/>
+        </w:rPr>
+        <w:t xml:space="preserve">...............................  </w:t>
       </w:r>
       <w:r>
         <w:rPr>
@@ -2446,6 +2716,7 @@
       <w:pPr>
         <w:bidi/>
         <w:spacing w:after="60"/>
+        <w:jc w:val="center"/>
       </w:pPr>
       <w:r>
         <w:rPr>
@@ -2499,7 +2770,28 @@
           <w:szCs w:val="24"/>
           <w:rtl/>
         </w:rPr>
-        <w:t xml:space="preserve">پردازش اسناد و استخراج متن  ............................................................  </w:t>
+        <w:t>پردازش اسناد و استخراج متن  .........................</w:t>
+      </w:r>
+      <w:r>
+        <w:rPr>
+          <w:rFonts w:hint="cs"/>
+          <w:b/>
+          <w:color w:val="1A1A1A"/>
+          <w:sz w:val="24"/>
+          <w:szCs w:val="24"/>
+          <w:rtl/>
+        </w:rPr>
+        <w:t>............................................................</w:t>
+      </w:r>
+      <w:r>
+        <w:rPr>
+          <w:b/>
+          <w:color w:val="1A1A1A"/>
+          <w:sz w:val="24"/>
+          <w:szCs w:val="24"/>
+          <w:rtl/>
+        </w:rPr>
+        <w:t xml:space="preserve">...................................  </w:t>
       </w:r>
       <w:r>
         <w:rPr>
@@ -2517,6 +2809,7 @@
       <w:pPr>
         <w:bidi/>
         <w:spacing w:after="60"/>
+        <w:jc w:val="center"/>
       </w:pPr>
       <w:r>
         <w:rPr>
@@ -2633,7 +2926,49 @@
           <w:szCs w:val="24"/>
           <w:rtl/>
         </w:rPr>
-        <w:t xml:space="preserve"> سند  ............................................................  </w:t>
+        <w:t xml:space="preserve"> سند  ...............................</w:t>
+      </w:r>
+      <w:r>
+        <w:rPr>
+          <w:rFonts w:hint="cs"/>
+          <w:b/>
+          <w:color w:val="1A1A1A"/>
+          <w:sz w:val="24"/>
+          <w:szCs w:val="24"/>
+          <w:rtl/>
+        </w:rPr>
+        <w:t>.......</w:t>
+      </w:r>
+      <w:r>
+        <w:rPr>
+          <w:b/>
+          <w:color w:val="1A1A1A"/>
+          <w:sz w:val="24"/>
+          <w:szCs w:val="24"/>
+          <w:rtl/>
+        </w:rPr>
+        <w:t>............</w:t>
+      </w:r>
+      <w:r>
+        <w:rPr>
+          <w:rFonts w:hint="cs"/>
+          <w:b/>
+          <w:color w:val="1A1A1A"/>
+          <w:sz w:val="24"/>
+          <w:szCs w:val="24"/>
+          <w:rtl/>
+        </w:rPr>
+        <w:t>............................................</w:t>
+      </w:r>
+      <w:r>
+        <w:rPr>
+          <w:b/>
+          <w:color w:val="1A1A1A"/>
+          <w:sz w:val="24"/>
+          <w:szCs w:val="24"/>
+          <w:rtl/>
+        </w:rPr>
+        <w:t xml:space="preserve">.................  </w:t>
       </w:r>
       <w:r>
         <w:rPr>
@@ -2651,6 +2986,7 @@
       <w:pPr>
         <w:bidi/>
         <w:spacing w:after="60"/>
+        <w:jc w:val="center"/>
       </w:pPr>
       <w:r>
         <w:rPr>
@@ -2779,7 +3115,28 @@
           <w:szCs w:val="24"/>
           <w:rtl/>
         </w:rPr>
-        <w:t xml:space="preserve"> پاسخ  ............................................................  </w:t>
+        <w:t xml:space="preserve"> پاسخ  ........................................</w:t>
+      </w:r>
+      <w:r>
+        <w:rPr>
+          <w:rFonts w:hint="cs"/>
+          <w:b/>
+          <w:color w:val="1A1A1A"/>
+          <w:sz w:val="24"/>
+          <w:szCs w:val="24"/>
+          <w:rtl/>
+        </w:rPr>
+        <w:t>............................................................................</w:t>
+      </w:r>
+      <w:r>
+        <w:rPr>
+          <w:b/>
+          <w:color w:val="1A1A1A"/>
+          <w:sz w:val="24"/>
+          <w:szCs w:val="24"/>
+          <w:rtl/>
+        </w:rPr>
+        <w:t xml:space="preserve">....................  </w:t>
       </w:r>
       <w:r>
         <w:rPr>
@@ -2797,6 +3154,7 @@
       <w:pPr>
         <w:bidi/>
         <w:spacing w:after="60"/>
+        <w:jc w:val="center"/>
       </w:pPr>
       <w:r>
         <w:rPr>
@@ -2882,7 +3240,28 @@
           <w:szCs w:val="24"/>
           <w:rtl/>
         </w:rPr>
-        <w:t xml:space="preserve"> پاسخ  ............................................................  </w:t>
+        <w:t xml:space="preserve"> پاسخ  ............................</w:t>
+      </w:r>
+      <w:r>
+        <w:rPr>
+          <w:rFonts w:hint="cs"/>
+          <w:b/>
+          <w:color w:val="1A1A1A"/>
+          <w:sz w:val="24"/>
+          <w:szCs w:val="24"/>
+          <w:rtl/>
+        </w:rPr>
+        <w:t>..........................................................</w:t>
+      </w:r>
+      <w:r>
+        <w:rPr>
+          <w:b/>
+          <w:color w:val="1A1A1A"/>
+          <w:sz w:val="24"/>
+          <w:szCs w:val="24"/>
+          <w:rtl/>
+        </w:rPr>
+        <w:t xml:space="preserve">................................  </w:t>
       </w:r>
       <w:r>
         <w:rPr>
@@ -2900,6 +3279,7 @@
       <w:pPr>
         <w:bidi/>
         <w:spacing w:after="60"/>
+        <w:jc w:val="center"/>
       </w:pPr>
       <w:r>
         <w:rPr>
@@ -3017,7 +3397,28 @@
           <w:szCs w:val="24"/>
           <w:rtl/>
         </w:rPr>
-        <w:t xml:space="preserve">  ............................................................  </w:t>
+        <w:t xml:space="preserve">  ................................</w:t>
+      </w:r>
+      <w:r>
+        <w:rPr>
+          <w:rFonts w:hint="cs"/>
+          <w:b/>
+          <w:color w:val="1A1A1A"/>
+          <w:sz w:val="24"/>
+          <w:szCs w:val="24"/>
+          <w:rtl/>
+        </w:rPr>
+        <w:t>.......................................................................</w:t>
+      </w:r>
+      <w:r>
+        <w:rPr>
+          <w:b/>
+          <w:color w:val="1A1A1A"/>
+          <w:sz w:val="24"/>
+          <w:szCs w:val="24"/>
+          <w:rtl/>
+        </w:rPr>
+        <w:t xml:space="preserve">............................  </w:t>
       </w:r>
       <w:r>
         <w:rPr>
@@ -3035,6 +3436,7 @@
       <w:pPr>
         <w:bidi/>
         <w:spacing w:after="60"/>
+        <w:jc w:val="center"/>
       </w:pPr>
       <w:r>
         <w:rPr>
@@ -3109,7 +3511,28 @@
           <w:szCs w:val="24"/>
           <w:rtl/>
         </w:rPr>
-        <w:t xml:space="preserve">  ............................................................  </w:t>
+        <w:t xml:space="preserve">  ................................</w:t>
+      </w:r>
+      <w:r>
+        <w:rPr>
+          <w:rFonts w:hint="cs"/>
+          <w:b/>
+          <w:color w:val="1A1A1A"/>
+          <w:sz w:val="24"/>
+          <w:szCs w:val="24"/>
+          <w:rtl/>
+        </w:rPr>
+        <w:t>..............................................................</w:t>
+      </w:r>
+      <w:r>
+        <w:rPr>
+          <w:b/>
+          <w:color w:val="1A1A1A"/>
+          <w:sz w:val="24"/>
+          <w:szCs w:val="24"/>
+          <w:rtl/>
+        </w:rPr>
+        <w:t xml:space="preserve">............................  </w:t>
       </w:r>
       <w:r>
         <w:rPr>
@@ -3127,6 +3550,7 @@
       <w:pPr>
         <w:bidi/>
         <w:spacing w:after="60"/>
+        <w:jc w:val="center"/>
       </w:pPr>
       <w:r>
         <w:rPr>
@@ -3180,7 +3604,28 @@
           <w:szCs w:val="24"/>
           <w:rtl/>
         </w:rPr>
-        <w:t xml:space="preserve">اشتراک گفتگو و بازخورد  ............................................................  </w:t>
+        <w:t>اشتراک گفتگو و بازخورد  ..............................</w:t>
+      </w:r>
+      <w:r>
+        <w:rPr>
+          <w:rFonts w:hint="cs"/>
+          <w:b/>
+          <w:color w:val="1A1A1A"/>
+          <w:sz w:val="24"/>
+          <w:szCs w:val="24"/>
+          <w:rtl/>
+        </w:rPr>
+        <w:t>.................................................................</w:t>
+      </w:r>
+      <w:r>
+        <w:rPr>
+          <w:b/>
+          <w:color w:val="1A1A1A"/>
+          <w:sz w:val="24"/>
+          <w:szCs w:val="24"/>
+          <w:rtl/>
+        </w:rPr>
+        <w:t xml:space="preserve">..............................  </w:t>
       </w:r>
       <w:r>
         <w:rPr>
@@ -3198,6 +3643,7 @@
       <w:pPr>
         <w:bidi/>
         <w:spacing w:after="60"/>
+        <w:jc w:val="center"/>
       </w:pPr>
       <w:r>
         <w:rPr>
@@ -3304,7 +3750,28 @@
           <w:szCs w:val="24"/>
           <w:rtl/>
         </w:rPr>
-        <w:t xml:space="preserve"> گزارش  ............................................................  </w:t>
+        <w:t xml:space="preserve"> گزارش  ............................</w:t>
+      </w:r>
+      <w:r>
+        <w:rPr>
+          <w:rFonts w:hint="cs"/>
+          <w:b/>
+          <w:color w:val="1A1A1A"/>
+          <w:sz w:val="24"/>
+          <w:szCs w:val="24"/>
+          <w:rtl/>
+        </w:rPr>
+        <w:t>..................................................................</w:t>
+      </w:r>
+      <w:r>
+        <w:rPr>
+          <w:b/>
+          <w:color w:val="1A1A1A"/>
+          <w:sz w:val="24"/>
+          <w:szCs w:val="24"/>
+          <w:rtl/>
+        </w:rPr>
+        <w:t xml:space="preserve">................................  </w:t>
       </w:r>
       <w:r>
         <w:rPr>
@@ -3322,6 +3789,7 @@
       <w:pPr>
         <w:bidi/>
         <w:spacing w:after="60"/>
+        <w:jc w:val="center"/>
       </w:pPr>
       <w:r>
         <w:rPr>
@@ -3418,7 +3886,28 @@
           <w:szCs w:val="24"/>
           <w:rtl/>
         </w:rPr>
-        <w:t xml:space="preserve">  ............................................................  </w:t>
+        <w:t xml:space="preserve">  .......................</w:t>
+      </w:r>
+      <w:r>
+        <w:rPr>
+          <w:rFonts w:hint="cs"/>
+          <w:b/>
+          <w:color w:val="1A1A1A"/>
+          <w:sz w:val="24"/>
+          <w:szCs w:val="24"/>
+          <w:rtl/>
+        </w:rPr>
+        <w:t>....................................................</w:t>
+      </w:r>
+      <w:r>
+        <w:rPr>
+          <w:b/>
+          <w:color w:val="1A1A1A"/>
+          <w:sz w:val="24"/>
+          <w:szCs w:val="24"/>
+          <w:rtl/>
+        </w:rPr>
+        <w:t xml:space="preserve">.....................................  </w:t>
       </w:r>
       <w:r>
         <w:rPr>
@@ -3436,6 +3925,7 @@
       <w:pPr>
         <w:bidi/>
         <w:spacing w:after="60"/>
+        <w:jc w:val="center"/>
       </w:pPr>
       <w:r>
         <w:rPr>
@@ -3553,7 +4043,28 @@
           <w:szCs w:val="24"/>
           <w:rtl/>
         </w:rPr>
-        <w:t xml:space="preserve">  ............................................................  </w:t>
+        <w:t xml:space="preserve">  .................................</w:t>
+      </w:r>
+      <w:r>
+        <w:rPr>
+          <w:rFonts w:hint="cs"/>
+          <w:b/>
+          <w:color w:val="1A1A1A"/>
+          <w:sz w:val="24"/>
+          <w:szCs w:val="24"/>
+          <w:rtl/>
+        </w:rPr>
+        <w:t>...............................................................</w:t>
+      </w:r>
+      <w:r>
+        <w:rPr>
+          <w:b/>
+          <w:color w:val="1A1A1A"/>
+          <w:sz w:val="24"/>
+          <w:szCs w:val="24"/>
+          <w:rtl/>
+        </w:rPr>
+        <w:t xml:space="preserve">...........................  </w:t>
       </w:r>
       <w:r>
         <w:rPr>
@@ -3571,6 +4082,7 @@
       <w:pPr>
         <w:bidi/>
         <w:spacing w:after="60"/>
+        <w:jc w:val="center"/>
       </w:pPr>
       <w:r>
         <w:rPr>
@@ -3688,7 +4200,28 @@
           <w:szCs w:val="24"/>
           <w:rtl/>
         </w:rPr>
-        <w:t xml:space="preserve">  ............................................................  </w:t>
+        <w:t xml:space="preserve">  ..........................</w:t>
+      </w:r>
+      <w:r>
+        <w:rPr>
+          <w:rFonts w:hint="cs"/>
+          <w:b/>
+          <w:color w:val="1A1A1A"/>
+          <w:sz w:val="24"/>
+          <w:szCs w:val="24"/>
+          <w:rtl/>
+        </w:rPr>
+        <w:t>......................................................</w:t>
+      </w:r>
+      <w:r>
+        <w:rPr>
+          <w:b/>
+          <w:color w:val="1A1A1A"/>
+          <w:sz w:val="24"/>
+          <w:szCs w:val="24"/>
+          <w:rtl/>
+        </w:rPr>
+        <w:t xml:space="preserve">..................................  </w:t>
       </w:r>
       <w:r>
         <w:rPr>
@@ -3706,6 +4239,7 @@
       <w:pPr>
         <w:bidi/>
         <w:spacing w:after="60"/>
+        <w:jc w:val="center"/>
       </w:pPr>
       <w:r>
         <w:rPr>
@@ -3759,7 +4293,28 @@
           <w:szCs w:val="24"/>
           <w:rtl/>
         </w:rPr>
-        <w:t xml:space="preserve">قرارداد داده و چرخه عمر  ............................................................  </w:t>
+        <w:t>قرارداد داده و چرخه عمر  ...............................</w:t>
+      </w:r>
+      <w:r>
+        <w:rPr>
+          <w:rFonts w:hint="cs"/>
+          <w:b/>
+          <w:color w:val="1A1A1A"/>
+          <w:sz w:val="24"/>
+          <w:szCs w:val="24"/>
+          <w:rtl/>
+        </w:rPr>
+        <w:t>...............................................................</w:t>
+      </w:r>
+      <w:r>
+        <w:rPr>
+          <w:b/>
+          <w:color w:val="1A1A1A"/>
+          <w:sz w:val="24"/>
+          <w:szCs w:val="24"/>
+          <w:rtl/>
+        </w:rPr>
+        <w:t xml:space="preserve">.............................  </w:t>
       </w:r>
       <w:r>
         <w:rPr>
@@ -3777,6 +4332,7 @@
       <w:pPr>
         <w:bidi/>
         <w:spacing w:after="60"/>
+        <w:jc w:val="center"/>
       </w:pPr>
       <w:r>
         <w:rPr>
@@ -3830,7 +4386,28 @@
           <w:szCs w:val="24"/>
           <w:rtl/>
         </w:rPr>
-        <w:t xml:space="preserve">قرارداد رابط‌ها و خطاها  ............................................................  </w:t>
+        <w:t>قرارداد رابط‌ها و خطاها  ...............................</w:t>
+      </w:r>
+      <w:r>
+        <w:rPr>
+          <w:rFonts w:hint="cs"/>
+          <w:b/>
+          <w:color w:val="1A1A1A"/>
+          <w:sz w:val="24"/>
+          <w:szCs w:val="24"/>
+          <w:rtl/>
+        </w:rPr>
+        <w:t>...................................................................</w:t>
+      </w:r>
+      <w:r>
+        <w:rPr>
+          <w:b/>
+          <w:color w:val="1A1A1A"/>
+          <w:sz w:val="24"/>
+          <w:szCs w:val="24"/>
+          <w:rtl/>
+        </w:rPr>
+        <w:t xml:space="preserve">.............................  </w:t>
       </w:r>
       <w:r>
         <w:rPr>
@@ -3848,6 +4425,7 @@
       <w:pPr>
         <w:bidi/>
         <w:spacing w:after="60"/>
+        <w:jc w:val="center"/>
       </w:pPr>
       <w:r>
         <w:rPr>
@@ -3965,7 +4543,28 @@
           <w:szCs w:val="24"/>
           <w:rtl/>
         </w:rPr>
-        <w:t xml:space="preserve"> اطلاعات  ............................................................  </w:t>
+        <w:t xml:space="preserve"> اطلاعات  .......................................</w:t>
+      </w:r>
+      <w:r>
+        <w:rPr>
+          <w:rFonts w:hint="cs"/>
+          <w:b/>
+          <w:color w:val="1A1A1A"/>
+          <w:sz w:val="24"/>
+          <w:szCs w:val="24"/>
+          <w:rtl/>
+        </w:rPr>
+        <w:t>..................................................................</w:t>
+      </w:r>
+      <w:r>
+        <w:rPr>
+          <w:b/>
+          <w:color w:val="1A1A1A"/>
+          <w:sz w:val="24"/>
+          <w:szCs w:val="24"/>
+          <w:rtl/>
+        </w:rPr>
+        <w:t xml:space="preserve">.....................  </w:t>
       </w:r>
       <w:r>
         <w:rPr>
@@ -3983,6 +4582,7 @@
       <w:pPr>
         <w:bidi/>
         <w:spacing w:after="60"/>
+        <w:jc w:val="center"/>
       </w:pPr>
       <w:r>
         <w:rPr>
@@ -4165,7 +4765,28 @@
           <w:szCs w:val="24"/>
           <w:rtl/>
         </w:rPr>
-        <w:t xml:space="preserve">  ............................................................  </w:t>
+        <w:t xml:space="preserve">  ..................................</w:t>
+      </w:r>
+      <w:r>
+        <w:rPr>
+          <w:rFonts w:hint="cs"/>
+          <w:b/>
+          <w:color w:val="1A1A1A"/>
+          <w:sz w:val="24"/>
+          <w:szCs w:val="24"/>
+          <w:rtl/>
+        </w:rPr>
+        <w:t>..................................................................</w:t>
+      </w:r>
+      <w:r>
+        <w:rPr>
+          <w:b/>
+          <w:color w:val="1A1A1A"/>
+          <w:sz w:val="24"/>
+          <w:szCs w:val="24"/>
+          <w:rtl/>
+        </w:rPr>
+        <w:t xml:space="preserve">.........................  </w:t>
       </w:r>
       <w:r>
         <w:rPr>
@@ -4183,6 +4804,7 @@
       <w:pPr>
         <w:bidi/>
         <w:spacing w:after="60"/>
+        <w:jc w:val="center"/>
       </w:pPr>
       <w:r>
         <w:rPr>
@@ -4343,7 +4965,28 @@
           <w:szCs w:val="24"/>
           <w:rtl/>
         </w:rPr>
-        <w:t xml:space="preserve">  ............................................................  </w:t>
+        <w:t xml:space="preserve">  .............................</w:t>
+      </w:r>
+      <w:r>
+        <w:rPr>
+          <w:rFonts w:hint="cs"/>
+          <w:b/>
+          <w:color w:val="1A1A1A"/>
+          <w:sz w:val="24"/>
+          <w:szCs w:val="24"/>
+          <w:rtl/>
+        </w:rPr>
+        <w:t>...........................................</w:t>
+      </w:r>
+      <w:r>
+        <w:rPr>
+          <w:b/>
+          <w:color w:val="1A1A1A"/>
+          <w:sz w:val="24"/>
+          <w:szCs w:val="24"/>
+          <w:rtl/>
+        </w:rPr>
+        <w:t xml:space="preserve">...............................  </w:t>
       </w:r>
       <w:r>
         <w:rPr>
@@ -4361,6 +5004,7 @@
       <w:pPr>
         <w:bidi/>
         <w:spacing w:after="60"/>
+        <w:jc w:val="center"/>
       </w:pPr>
       <w:r>
         <w:rPr>
@@ -4489,7 +5133,28 @@
           <w:szCs w:val="24"/>
           <w:rtl/>
         </w:rPr>
-        <w:t xml:space="preserve"> انتها به انتها  ............................................................  </w:t>
+        <w:t xml:space="preserve"> انتها به انتها  ...............................</w:t>
+      </w:r>
+      <w:r>
+        <w:rPr>
+          <w:rFonts w:hint="cs"/>
+          <w:b/>
+          <w:color w:val="1A1A1A"/>
+          <w:sz w:val="24"/>
+          <w:szCs w:val="24"/>
+          <w:rtl/>
+        </w:rPr>
+        <w:t>..................................................</w:t>
+      </w:r>
+      <w:r>
+        <w:rPr>
+          <w:b/>
+          <w:color w:val="1A1A1A"/>
+          <w:sz w:val="24"/>
+          <w:szCs w:val="24"/>
+          <w:rtl/>
+        </w:rPr>
+        <w:t xml:space="preserve">.............................  </w:t>
       </w:r>
       <w:r>
         <w:rPr>
@@ -4507,6 +5172,7 @@
       <w:pPr>
         <w:bidi/>
         <w:spacing w:after="60"/>
+        <w:jc w:val="center"/>
       </w:pPr>
       <w:r>
         <w:rPr>
@@ -4635,7 +5301,28 @@
           <w:szCs w:val="24"/>
           <w:rtl/>
         </w:rPr>
-        <w:t xml:space="preserve">  ............................................................  </w:t>
+        <w:t xml:space="preserve">  ..............</w:t>
+      </w:r>
+      <w:r>
+        <w:rPr>
+          <w:rFonts w:hint="cs"/>
+          <w:b/>
+          <w:color w:val="1A1A1A"/>
+          <w:sz w:val="24"/>
+          <w:szCs w:val="24"/>
+          <w:rtl/>
+        </w:rPr>
+        <w:t>..................................................................</w:t>
+      </w:r>
+      <w:r>
+        <w:rPr>
+          <w:b/>
+          <w:color w:val="1A1A1A"/>
+          <w:sz w:val="24"/>
+          <w:szCs w:val="24"/>
+          <w:rtl/>
+        </w:rPr>
+        <w:t xml:space="preserve">..............................................  </w:t>
       </w:r>
       <w:r>
         <w:rPr>
@@ -4653,6 +5340,7 @@
       <w:pPr>
         <w:bidi/>
         <w:spacing w:after="60"/>
+        <w:jc w:val="center"/>
       </w:pPr>
       <w:r>
         <w:rPr>
@@ -4749,7 +5437,28 @@
           <w:szCs w:val="24"/>
           <w:rtl/>
         </w:rPr>
-        <w:t xml:space="preserve"> باز  ............................................................  </w:t>
+        <w:t xml:space="preserve"> باز  ..........</w:t>
+      </w:r>
+      <w:r>
+        <w:rPr>
+          <w:rFonts w:hint="cs"/>
+          <w:b/>
+          <w:color w:val="1A1A1A"/>
+          <w:sz w:val="24"/>
+          <w:szCs w:val="24"/>
+          <w:rtl/>
+        </w:rPr>
+        <w:t>..........................................................</w:t>
+      </w:r>
+      <w:r>
+        <w:rPr>
+          <w:b/>
+          <w:color w:val="1A1A1A"/>
+          <w:sz w:val="24"/>
+          <w:szCs w:val="24"/>
+          <w:rtl/>
+        </w:rPr>
+        <w:t xml:space="preserve">..................................................  </w:t>
       </w:r>
       <w:r>
         <w:rPr>
@@ -4767,6 +5476,7 @@
       <w:pPr>
         <w:bidi/>
         <w:spacing w:after="60"/>
+        <w:jc w:val="center"/>
         <w:rPr>
           <w:rFonts w:asciiTheme="minorHAnsi" w:hAnsiTheme="minorHAnsi"/>
         </w:rPr>
@@ -4834,7 +5544,28 @@
           <w:szCs w:val="24"/>
           <w:rtl/>
         </w:rPr>
-        <w:t xml:space="preserve">منابع و واژه‌نامه  ............................................................  </w:t>
+        <w:t>منابع و واژه‌نامه  ..............................</w:t>
+      </w:r>
+      <w:r>
+        <w:rPr>
+          <w:rFonts w:hint="cs"/>
+          <w:b/>
+          <w:color w:val="1A1A1A"/>
+          <w:sz w:val="24"/>
+          <w:szCs w:val="24"/>
+          <w:rtl/>
+        </w:rPr>
+        <w:t>..............................................................................</w:t>
+      </w:r>
+      <w:r>
+        <w:rPr>
+          <w:b/>
+          <w:color w:val="1A1A1A"/>
+          <w:sz w:val="24"/>
+          <w:szCs w:val="24"/>
+          <w:rtl/>
+        </w:rPr>
+        <w:t xml:space="preserve">..............................  </w:t>
       </w:r>
       <w:r>
         <w:rPr>
@@ -5138,7 +5869,25 @@
           <w:sz w:val="24"/>
           <w:szCs w:val="24"/>
         </w:rPr>
-        <w:t xml:space="preserve"> Nexora </w:t>
+        <w:t xml:space="preserve"> </w:t>
+      </w:r>
+      <w:proofErr w:type="spellStart"/>
+      <w:r>
+        <w:rPr>
+          <w:rFonts w:asciiTheme="minorHAnsi" w:hAnsiTheme="minorHAnsi"/>
+          <w:sz w:val="24"/>
+          <w:szCs w:val="24"/>
+        </w:rPr>
+        <w:t>Nexora</w:t>
+      </w:r>
+      <w:proofErr w:type="spellEnd"/>
+      <w:r>
+        <w:rPr>
+          <w:rFonts w:asciiTheme="minorHAnsi" w:hAnsiTheme="minorHAnsi"/>
+          <w:sz w:val="24"/>
+          <w:szCs w:val="24"/>
+        </w:rPr>
+        <w:t xml:space="preserve"> </w:t>
       </w:r>
       <w:r>
         <w:rPr>
@@ -8595,7 +9344,23 @@
           <w:sz w:val="24"/>
           <w:szCs w:val="24"/>
         </w:rPr>
-        <w:t xml:space="preserve"> Nexora </w:t>
+        <w:t xml:space="preserve"> </w:t>
+      </w:r>
+      <w:proofErr w:type="spellStart"/>
+      <w:r>
+        <w:rPr>
+          <w:sz w:val="24"/>
+          <w:szCs w:val="24"/>
+        </w:rPr>
+        <w:t>Nexora</w:t>
+      </w:r>
+      <w:proofErr w:type="spellEnd"/>
+      <w:r>
+        <w:rPr>
+          <w:sz w:val="24"/>
+          <w:szCs w:val="24"/>
+        </w:rPr>
+        <w:t xml:space="preserve"> </w:t>
       </w:r>
       <w:r>
         <w:rPr>
@@ -10201,6 +10966,7 @@
         </w:rPr>
         <w:t xml:space="preserve"> نسخه از </w:t>
       </w:r>
+      <w:proofErr w:type="spellStart"/>
       <w:r>
         <w:rPr>
           <w:sz w:val="24"/>
@@ -10208,6 +10974,7 @@
         </w:rPr>
         <w:t>Nexora</w:t>
       </w:r>
+      <w:proofErr w:type="spellEnd"/>
       <w:r>
         <w:rPr>
           <w:sz w:val="24"/>
@@ -44545,6 +45312,7 @@
       </w:rPr>
       <w:t xml:space="preserve">| سند نیازمندی های </w:t>
     </w:r>
+    <w:proofErr w:type="spellStart"/>
     <w:r>
       <w:rPr>
         <w:rFonts w:ascii="Cyber Copix" w:hAnsi="Cyber Copix" w:cs="Calibri"/>
@@ -44554,6 +45322,7 @@
       </w:rPr>
       <w:t>Nexora</w:t>
     </w:r>
+    <w:proofErr w:type="spellEnd"/>
   </w:p>
 </w:ftr>
 </file>
@@ -44641,6 +45410,7 @@
       </w:rPr>
       <w:t xml:space="preserve">| سند نیازمندی های </w:t>
     </w:r>
+    <w:proofErr w:type="spellStart"/>
     <w:r>
       <w:rPr>
         <w:rFonts w:ascii="Cyber Copix" w:hAnsi="Cyber Copix" w:cs="Calibri"/>
@@ -44650,6 +45420,7 @@
       </w:rPr>
       <w:t>Nexora</w:t>
     </w:r>
+    <w:proofErr w:type="spellEnd"/>
   </w:p>
   <w:p>
     <w:pPr>
@@ -44764,6 +45535,7 @@
       </w:rPr>
       <w:t xml:space="preserve">| سند نیازمندی های </w:t>
     </w:r>
+    <w:proofErr w:type="spellStart"/>
     <w:r>
       <w:rPr>
         <w:rFonts w:ascii="Cyber Copix" w:hAnsi="Cyber Copix" w:cs="Calibri"/>
@@ -44773,6 +45545,7 @@
       </w:rPr>
       <w:t>Nexora</w:t>
     </w:r>
+    <w:proofErr w:type="spellEnd"/>
   </w:p>
 </w:ftr>
 </file>
@@ -56599,6 +57372,7 @@
   </w:compat>
   <w:rsids>
     <w:rsidRoot w:val="008D47FC"/>
+    <w:rsid w:val="005D6193"/>
     <w:rsid w:val="008D47FC"/>
     <w:rsid w:val="00903669"/>
     <w:rsid w:val="00A4332D"/>

</xml_diff>